<commit_message>
fix(imi): schedule Item 3 reference; add qs.imi.exposure.fee_income (PLT-657)
Co-Authored-By: Claude Sonnet 5.5 <noreply@anthropic.com>
Claude-Session: https://claude.ai/code/session_01WhPgjY4EBrTXYZjXkLw6eM
</commit_message>
<xml_diff>
--- a/wordings/downloads/Meridian_Investment_Management_Insurance_v1.3.0-DRAFT.docx
+++ b/wordings/downloads/Meridian_Investment_Management_Insurance_v1.3.0-DRAFT.docx
@@ -545,7 +545,23 @@
                 <w:b w:val="0"/>
                 <w:i w:val="0"/>
               </w:rPr>
-              <w:t xml:space="preserve"> (Professional Liability) and 3 (Directors' and Officers' Liability). </w:t>
+              <w:t xml:space="preserve"> and </w:t>
+            </w:r>
+            <w:hyperlink w:anchor="c_imi_section_do">
+              <w:r>
+                <w:rPr>
+                  <w:color w:val="2E5C4E"/>
+                  <w:u w:val="single"/>
+                </w:rPr>
+                <w:t xml:space="preserve">the Directors' and Officers' Liability section</w:t>
+              </w:r>
+            </w:hyperlink>
+            <w:r>
+              <w:rPr>
+                <w:b w:val="0"/>
+                <w:i w:val="0"/>
+              </w:rPr>
+              <w:t xml:space="preserve">. </w:t>
             </w:r>
             <w:hyperlink w:anchor="c_imi_section_crime">
               <w:r>

</xml_diff>